<commit_message>
Documenta rinnovo sessione e sync real-time
Aggiorna README, documentazione e diagrammi per descrivere il rinnovo condiviso tra REST e Socket.IO, la gestione della scadenza dei token e il recupero di messaggi e commenti dopo la riconnessione.
</commit_message>
<xml_diff>
--- a/Documentazione - Esame/Descrizione Componenti React.docx
+++ b/Documentazione - Esame/Descrizione Componenti React.docx
@@ -123,17 +123,52 @@
           <w:b/>
           <w:bCs/>
         </w:rPr>
+        <w:t>CONTESTO DI AUTENTICAZIONE E SINCRONIZZAZIONE</w:t>
+      </w:r>
+    </w:p>
+    <w:p>
+      <w:r>
+        <w:t>• AuthContext: Conserva user e token nello stato React. Ascolta session-changed, emesso dopo il rinnovo o la pulizia della sessione, e storage per aggiornare il contesto dai dati del localStorage. Il rinnovo del token aggiorna così anche il ciclo di vita di useSocket; la rimozione dell'utente fa intervenire le route protette con il ritorno al login.</w:t>
+      </w:r>
+    </w:p>
+    <w:p>
+      <w:r>
+        <w:t>• axios.js e authServices: refreshSession() condivide refreshPromise tra le richieste REST e Socket.IO della stessa scheda, evitando rotazioni concorrenti nello stesso client. Su un 401 tardivo, Axios riutilizza il token già rinnovato; esclude dal rinnovo automatico login, registrazione, refresh, logout e richieste già ritentate. Un Refresh Token assente o un rinnovo rifiutato con 401/403 puliscono la sessione; gli errori temporanei di rete o del server conservano i dati locali. Se durante il rinnovo cambia il Refresh Token locale, la risposta viene scartata. Il logout rimuove subito il Refresh Token locale, tenta la revoca sul server e completa comunque la pulizia. La Promise non coordina schede o dispositivi diversi.</w:t>
+      </w:r>
+    </w:p>
+    <w:p>
+      <w:pPr>
+        <w:jc w:val="center"/>
+        <w:rPr>
+          <w:b/>
+          <w:bCs/>
+        </w:rPr>
+      </w:pPr>
+      <w:r>
+        <w:rPr>
+          <w:b/>
+          <w:bCs/>
+        </w:rPr>
         <w:t>HOOK CONDIVISI</w:t>
       </w:r>
     </w:p>
     <w:p>
       <w:r>
-        <w:t>•useSocket: Gestisce la connessione Socket.IO solo in presenza di una sessione. Si collega direttamente a http://localhost:4000. Invia l'Access Token nell'handshake tramite auth.token, rileggendolo dal localStorage ad ogni connessione per utilizzare l'eventuale token rinnovato dal flusso REST. Ad ogni evento connect esegue join_chat o join_post; riceve receive_message e receive_comment e delega gli aggiornamenti alle callback delle pagine. Registra connect_error senza avviare autonomamente il refresh. Al cambio di pagina, stanza o sessione chiude la connessione precedente; il cleanup la chiude anche al logout. Non espone funzioni di invio: messaggi e commenti vengono creati esclusivamente tramite REST. Nel Compose attuale la porta 4000 non è pubblicata sull'host: il collegamento diretto richiede un backend raggiungibile dal browser a quell'indirizzo.</w:t>
-      </w:r>
-    </w:p>
-    <w:p>
-      <w:r>
-        <w:t>•Autorizzazione lato server: backend/socket.js configura io.use per verificare firma, scadenza, algoritmo HS256 e formato dell'identità userId. join_chat accetta solo un ObjectId in formato stringa e verifica su Chat che l'utente autenticato sia un partecipante; join_post verifica il formato dell'ID e l'esistenza del post, visibile a tutti gli utenti autenticati. Le room sono chat_&lt;chatId&gt; e post_&lt;postId&gt;, con ID normalizzati in minuscolo. I vecchi eventi client send_message e send_comment non hanno più handler: solo i controller REST possono trasmettere i documenti salvati e popolati.</w:t>
+        <w:t xml:space="preserve">• useSocket: Apre la connessione solo con una sessione e una chat o un post attivo. Usa l'origine del frontend e il proxy /socket.io/ di Vite o Nginx, senza richiedere l'esposizione della porta backend in Docker. VITE_SOCKET_URL permette un'origine alternativa configurata all'avvio o durante la build Vite. Invia auth.token rileggendolo dal localStorage ad ogni handshake. Ad ogni connect esegue join_chat o join_post e attende un ack positivo prima di richiamare onReady per la sincronizzazione REST. Riceve receive_message e </w:t>
+      </w:r>
+      <w:r>
+        <w:lastRenderedPageBreak/>
+        <w:t>receive_comment e delega gli aggiornamenti alle pagine. Su connect_error con data.code TOKEN_EXPIRED o su session_expired usa refreshSession() e riapre la connessione dopo il rinnovo. Se il rinnovo fallisce temporaneamente e la sessione esiste ancora, riprova dopo 5 secondi. Il join ha un timeout di 10 secondi; timeout e TEMPORARY_ERROR provocano un nuovo tentativo dopo 2 secondi, mentre un errore della sincronizzazione REST provoca un tentativo dopo 5 secondi. Il cleanup chiude il socket, cancella i timer e invalida la sincronizzazione al cambio di pagina, stanza o sessione. Messaggi e commenti vengono creati esclusivamente tramite REST.</w:t>
+      </w:r>
+    </w:p>
+    <w:p>
+      <w:r>
+        <w:t>• Autorizzazione lato server: backend/socket.js verifica firma, scadenza, algoritmo HS256, formato di userId e presenza di exp numerico nell'handshake. Conserva userId ed expiresAt e, alla scadenza, emette session_expired e disconnette il client. join_chat accetta una stringa ObjectId e verifica la partecipazione alla chat; join_post verifica formato dell'ID ed esistenza del post. Ricontrolla validità della sessione e connessione dopo le query asincrone. I join restituiscono un ack { ok: true } dopo l'ingresso, { ok: false } per rifiuto o ID non valido, oppure { ok: false, code: 'TEMPORARY_ERROR' } per errori delle query. Le room chat_&lt;chatId&gt; e post_&lt;postId&gt; usano ID in minuscolo. Non sono presenti handler send_message o send_comment: solo i controller REST trasmettono i documenti salvati e popolati.</w:t>
+      </w:r>
+    </w:p>
+    <w:p>
+      <w:r>
+        <w:t>• Sincronizzazione Chat e PostDetail: Dopo ogni join confermato, ricaricano tramite REST i messaggi o i commenti, recuperando i contenuti persi durante una disconnessione. utils/realtime.js unisce lo snapshot con gli eventi arrivati durante la richiesta, deduplica per _id e ordina per createdAt. Le pagine filtrano gli eventi per stanza e scartano richieste superate o risposte per schermate non più attive. PostDetail evita inoltre che uno snapshot tardivo ripristini un commento eliminato localmente. Modifiche e cancellazioni di altri client non sono trasmesse come eventi real-time.</w:t>
       </w:r>
     </w:p>
     <w:sectPr>

</xml_diff>